<commit_message>
Fix R-01: weight album gain by track duration
Album gain averaged each track's integrated loudness, so a ten-second track
counted as much as a thirty-minute one. The audit's pair (10 s at -10 LUFS,
30 s at -30 LUFS) was tagged +4.0 dB where the combined signal needs about
-0.1 dB.

get_metrics now returns the file's duration, parsed from the same ebur128
banner with one ffprobe fallback; calculate_album_gain weights each track's
mean-square energy by it and refuses a missing or non-positive duration
instead of weighting it with a guess. The processor reports a file whose
duration cannot be read as a per-file error.

Tests pin the duration-weighted formula, every duration guard, and a real
concatenated ebur128 measurement within 0.2 dB of the written tag. With the
old mean formula the new tests fail (tag +9.50 dB against measured +12.90 dB)
and pass after the fix. The ReplayGain guide and CHANGELOG say what album
gain now measures.
</commit_message>
<xml_diff>
--- a/user_guides/individual_programs/replaygain_analyzer/ReplayGain_Analyzer_User_Guide.docx
+++ b/user_guides/individual_programs/replaygain_analyzer/ReplayGain_Analyzer_User_Guide.docx
@@ -175,7 +175,7 @@
         <w:t xml:space="preserve">Target LUFS: </w:t>
       </w:r>
       <w:r>
-        <w:t>Desired integrated loudness target. Track gain is target LUFS minus measured LUFS; album gain uses the mean LUFS for each folder.</w:t>
+        <w:t>Desired integrated loudness target. Track gain is target LUFS minus measured LUFS; album gain uses the folder's combined loudness, weighted by each file's duration.</w:t>
       </w:r>
     </w:p>
     <w:p>
@@ -249,7 +249,7 @@
         <w:pStyle w:val="ListNumber"/>
       </w:pPr>
       <w:r>
-        <w:t>For each folder, calculate album gain as target LUFS minus the mean file LUFS.</w:t>
+        <w:t>For each folder, calculate album gain as target LUFS minus the combined loudness of its files: each file's energy is weighted by its duration, so a long quiet track counts less than a short loud one.</w:t>
       </w:r>
     </w:p>
     <w:p>
@@ -317,7 +317,7 @@
         <w:t xml:space="preserve">Album Gain: </w:t>
       </w:r>
       <w:r>
-        <w:t>The folder-level gain derived from the mean integrated LUFS of that folder.</w:t>
+        <w:t>The folder-level gain derived from the duration-weighted combined loudness of that folder, which is what a player applies to the album as a whole.</w:t>
       </w:r>
     </w:p>
     <w:p>
@@ -555,7 +555,7 @@
         <w:t xml:space="preserve">A folder's album gain looks unexpected: </w:t>
       </w:r>
       <w:r>
-        <w:t>Album gain is calculated per folder from the mean LUFS of only the files that measured successfully.</w:t>
+        <w:t>Album gain is calculated per folder from the duration-weighted loudness of only the files that measured successfully. A file whose duration cannot be read is reported as an error rather than counted as zero, so check the folder's error count before judging the album value.</w:t>
       </w:r>
     </w:p>
     <w:p>

</xml_diff>